<commit_message>
docs: SOW-M2 (collect hardening + ratio model, thresholds, forecast job); fold M1.1 into Part A
</commit_message>
<xml_diff>
--- a/UrbanPulse_구현설계서.docx
+++ b/UrbanPulse_구현설계서.docx
@@ -2,13 +2,13 @@
 <file path=word/document.xml><?xml version="1.0" encoding="utf-8"?>
 <w:document xmlns:w="http://schemas.openxmlformats.org/wordprocessingml/2006/main" xmlns:m="http://schemas.openxmlformats.org/officeDocument/2006/math" xmlns:r="http://schemas.openxmlformats.org/officeDocument/2006/relationships" xmlns:o="urn:schemas-microsoft-com:office:office" xmlns:v="urn:schemas-microsoft-com:vml" xmlns:w10="urn:schemas-microsoft-com:office:word" xmlns:a="http://schemas.openxmlformats.org/drawingml/2006/main" xmlns:pic="http://schemas.openxmlformats.org/drawingml/2006/picture" xmlns:wp="http://schemas.openxmlformats.org/drawingml/2006/wordprocessingDrawing">
   <w:body>
-    <w:bookmarkStart w:id="40" w:name="urbanpulse-구현-설계서-v7.1-2026-10-01"/>
+    <w:bookmarkStart w:id="40" w:name="urbanpulse-구현-설계서-v7.2-2026-10-01"/>
     <w:p>
       <w:pPr>
         <w:pStyle w:val="Heading1"/>
       </w:pPr>
       <w:r>
-        <w:t xml:space="preserve">UrbanPulse 구현 설계서 v7.1 (2026-10-01)</w:t>
+        <w:t xml:space="preserve">UrbanPulse 구현 설계서 v7.2 (2026-10-01)</w:t>
       </w:r>
     </w:p>
     <w:p>
@@ -53,6 +53,66 @@
       </w:r>
       <w:r>
         <w:t xml:space="preserve">에 있습니다.</w:t>
+      </w:r>
+      <w:r>
+        <w:t xml:space="preserve"> </w:t>
+      </w:r>
+      <w:r>
+        <w:t xml:space="preserve">v7.2: M1 검수에서 나온 사실을 반영했습니다(작업 지시서</w:t>
+      </w:r>
+      <w:r>
+        <w:t xml:space="preserve"> </w:t>
+      </w:r>
+      <w:r>
+        <w:rPr>
+          <w:rStyle w:val="VerbatimChar"/>
+        </w:rPr>
+        <w:t xml:space="preserve">docs/sow/SOW-M2.md</w:t>
+      </w:r>
+      <w:r>
+        <w:t xml:space="preserve">). ① 수집은 원본을 먼저 저장하고 DB는 그다음에 씁니다(DB가 꺼져도 원본은 남고,</w:t>
+      </w:r>
+      <w:r>
+        <w:t xml:space="preserve"> </w:t>
+      </w:r>
+      <w:r>
+        <w:rPr>
+          <w:rStyle w:val="VerbatimChar"/>
+        </w:rPr>
+        <w:t xml:space="preserve">ingest_raw</w:t>
+      </w:r>
+      <w:r>
+        <w:t xml:space="preserve">로 나중에 넣음). ② 장소의 등급과 제공 상태는 과거 추출본이 아니라 수집된 데이터로 매일 다시 정합니다(결제 데이터가 최근 28일에 있으면 A1, 실시간이 7일 없으면 꺼짐, 모델 번호표·단계 경계·14일 이력이 있으면 켬).</w:t>
+      </w:r>
+      <w:r>
+        <w:t xml:space="preserve"> </w:t>
+      </w:r>
+      <w:r>
+        <w:t xml:space="preserve">“데이터가 없던 10곳”</w:t>
+      </w:r>
+      <w:r>
+        <w:t xml:space="preserve">(POI122~131)이 지금은 데이터를 주고 있어서입니다. ③ 시간별 값은 그 시각 구간의 평균(내림)으로 정의합니다. 연구 코드는 30분 단위 시각을 짝수 시로 반올림해서 홀수 시가 비어 있었고, 백테스트의</w:t>
+      </w:r>
+      <w:r>
+        <w:t xml:space="preserve"> </w:t>
+      </w:r>
+      <w:r>
+        <w:t xml:space="preserve">“1시간 빈칸”</w:t>
+      </w:r>
+      <w:r>
+        <w:t xml:space="preserve">이 여기서 나왔습니다. 모델 이식은 옛 격자로 연구 수치를 재현해 증명하고, 운영 모델은 새 격자로 다시 평가해 관문을 판정합니다. ④ 결제 업종은 8개 고정 키로 저장합니다. ⑤ 공휴일은 API의</w:t>
+      </w:r>
+      <w:r>
+        <w:t xml:space="preserve"> </w:t>
+      </w:r>
+      <w:r>
+        <w:rPr>
+          <w:rStyle w:val="VerbatimChar"/>
+        </w:rPr>
+        <w:t xml:space="preserve">isHoliday</w:t>
+      </w:r>
+      <w:r>
+        <w:t xml:space="preserve">가 Y인 날만 씁니다.</w:t>
       </w:r>
       <w:r>
         <w:t xml:space="preserve"> </w:t>

</xml_diff>